<commit_message>
fix: 80+ spec failures - MHTML separation, serialization, and API fixes
Key fixes:
- MHTML architecture: Separate class tree from OOXML (Mhtml::Document, etc.)
- Style library path: Fixed STYLES_DIR to point to correct config/styles/
- Style builder: Use property setters for wrapper objects
- add_paragraph: Handle Paragraph objects passed as argument
- DSL autoload: Fix capitalization (Dsl -> DSL)
- Table header: Set properties.header instead of direct attribute
- DocumentRoot: Add render_default: true for body, remove mixed_content
- Line spacing: Use Properties::Spacing for proper XML serialization
- Spec updates: Fix MHTML type expectations, remove obsolete pending tests

Test progress: 282 failures -> 202 failures (80 fixed)
</commit_message>
<xml_diff>
--- a/test_output/docprops_roundtrip.docx
+++ b/test_output/docprops_roundtrip.docx
@@ -3739,7 +3739,7 @@
         <w:top w:val="dotted" w:sz="2" w:space="1" w:color="134163"/>
         <w:bottom w:val="dotted" w:sz="2" w:space="6" w:color="134163"/>
       </w:pBdr>
-      <w:spacing w:before="500" w:after="300" w:line="240.0" w:lineRule="auto"/>
+      <w:spacing w:before="500" w:after="300" w:line="240" w:lineRule="auto"/>
       <w:jc w:val="center"/>
     </w:pPr>
     <w:rPr>
@@ -3771,7 +3771,7 @@
     <w:uiPriority w:val="11"/>
     <w:qFormat/>
     <w:pPr>
-      <w:spacing w:after="560" w:line="240.0" w:lineRule="auto"/>
+      <w:spacing w:after="560" w:line="240" w:lineRule="auto"/>
       <w:jc w:val="center"/>
     </w:pPr>
     <w:rPr>
@@ -3849,7 +3849,7 @@
         <w:top w:val="dotted" w:sz="2" w:space="10" w:color="134163"/>
         <w:bottom w:val="dotted" w:sz="2" w:space="4" w:color="134163"/>
       </w:pBdr>
-      <w:spacing w:before="160" w:line="300.0" w:lineRule="auto"/>
+      <w:spacing w:before="160" w:line="300" w:lineRule="auto"/>
       <w:ind w:left="1440" w:right="1440"/>
     </w:pPr>
     <w:rPr>
@@ -3928,7 +3928,7 @@
     <w:uiPriority w:val="1"/>
     <w:qFormat/>
     <w:pPr>
-      <w:spacing w:after="0" w:line="240.0" w:lineRule="auto"/>
+      <w:spacing w:after="0" w:line="240" w:lineRule="auto"/>
     </w:pPr>
   </w:style>
   <w:style w:type="character" w:styleId="NoSpacingChar" w:customStyle="true">

</xml_diff>